<commit_message>
Version 1.0 del Modelo LSTM
</commit_message>
<xml_diff>
--- a/docs/Campos Guardados en la variable Subject.docx
+++ b/docs/Campos Guardados en la variable Subject.docx
@@ -180,7 +180,6 @@
                 <w:szCs w:val="16"/>
               </w:rPr>
             </w:pPr>
-            <w:proofErr w:type="spellStart"/>
             <w:r>
               <w:rPr>
                 <w:sz w:val="18"/>
@@ -188,7 +187,6 @@
               </w:rPr>
               <w:t>fs</w:t>
             </w:r>
-            <w:proofErr w:type="spellEnd"/>
           </w:p>
         </w:tc>
         <w:tc>
@@ -259,7 +257,6 @@
                 <w:szCs w:val="16"/>
               </w:rPr>
             </w:pPr>
-            <w:proofErr w:type="spellStart"/>
             <w:r>
               <w:rPr>
                 <w:sz w:val="18"/>
@@ -267,7 +264,6 @@
               </w:rPr>
               <w:t>events</w:t>
             </w:r>
-            <w:proofErr w:type="spellEnd"/>
           </w:p>
         </w:tc>
         <w:tc>
@@ -314,75 +310,7 @@
                 <w:sz w:val="18"/>
                 <w:szCs w:val="16"/>
               </w:rPr>
-              <w:t xml:space="preserve">Instantes (en muestras) de los eventos de la marcha: columnas 1 y 2: </w:t>
-            </w:r>
-            <w:proofErr w:type="spellStart"/>
-            <w:proofErr w:type="gramStart"/>
-            <w:r>
-              <w:rPr>
-                <w:sz w:val="18"/>
-                <w:szCs w:val="16"/>
-              </w:rPr>
-              <w:t>TouchDown</w:t>
-            </w:r>
-            <w:proofErr w:type="spellEnd"/>
-            <w:proofErr w:type="gramEnd"/>
-            <w:r>
-              <w:rPr>
-                <w:sz w:val="18"/>
-                <w:szCs w:val="16"/>
-              </w:rPr>
-              <w:t xml:space="preserve"> y </w:t>
-            </w:r>
-            <w:proofErr w:type="spellStart"/>
-            <w:r>
-              <w:rPr>
-                <w:sz w:val="18"/>
-                <w:szCs w:val="16"/>
-              </w:rPr>
-              <w:t>ToeOff</w:t>
-            </w:r>
-            <w:proofErr w:type="spellEnd"/>
-            <w:r>
-              <w:rPr>
-                <w:sz w:val="18"/>
-                <w:szCs w:val="16"/>
-              </w:rPr>
-              <w:t xml:space="preserve"> izquierdos; columnas 3 y 4: </w:t>
-            </w:r>
-            <w:proofErr w:type="spellStart"/>
-            <w:proofErr w:type="gramStart"/>
-            <w:r>
-              <w:rPr>
-                <w:sz w:val="18"/>
-                <w:szCs w:val="16"/>
-              </w:rPr>
-              <w:t>TouchDown</w:t>
-            </w:r>
-            <w:proofErr w:type="spellEnd"/>
-            <w:proofErr w:type="gramEnd"/>
-            <w:r>
-              <w:rPr>
-                <w:sz w:val="18"/>
-                <w:szCs w:val="16"/>
-              </w:rPr>
-              <w:t xml:space="preserve"> y </w:t>
-            </w:r>
-            <w:proofErr w:type="spellStart"/>
-            <w:r>
-              <w:rPr>
-                <w:sz w:val="18"/>
-                <w:szCs w:val="16"/>
-              </w:rPr>
-              <w:t>ToeOff</w:t>
-            </w:r>
-            <w:proofErr w:type="spellEnd"/>
-            <w:r>
-              <w:rPr>
-                <w:sz w:val="18"/>
-                <w:szCs w:val="16"/>
-              </w:rPr>
-              <w:t xml:space="preserve"> derechos.</w:t>
+              <w:t>Instantes (en muestras) de los eventos de la marcha: columnas 1 y 2: TouchDown y ToeOff izquierdos; columnas 3 y 4: TouchDown y ToeOff derechos.</w:t>
             </w:r>
           </w:p>
         </w:tc>
@@ -403,7 +331,6 @@
                 <w:szCs w:val="16"/>
               </w:rPr>
             </w:pPr>
-            <w:proofErr w:type="spellStart"/>
             <w:r>
               <w:rPr>
                 <w:sz w:val="18"/>
@@ -411,7 +338,6 @@
               </w:rPr>
               <w:t>events_wmidswing</w:t>
             </w:r>
-            <w:proofErr w:type="spellEnd"/>
           </w:p>
         </w:tc>
         <w:tc>
@@ -458,15 +384,7 @@
                 <w:sz w:val="18"/>
                 <w:szCs w:val="16"/>
               </w:rPr>
-              <w:t>Instantes de eventos más detallados para cada paso (</w:t>
-            </w:r>
-            <w:proofErr w:type="spellStart"/>
-            <w:r>
-              <w:rPr>
-                <w:sz w:val="18"/>
-                <w:szCs w:val="16"/>
-              </w:rPr>
-              <w:t>mid</w:t>
+              <w:t>Instantes de eventos más detallados para cada paso (mid</w:t>
             </w:r>
             <w:r>
               <w:rPr>
@@ -474,15 +392,7 @@
                 <w:szCs w:val="16"/>
               </w:rPr>
               <w:noBreakHyphen/>
-              <w:t>stance</w:t>
-            </w:r>
-            <w:proofErr w:type="spellEnd"/>
-            <w:r>
-              <w:rPr>
-                <w:sz w:val="18"/>
-                <w:szCs w:val="16"/>
-              </w:rPr>
-              <w:t>, toe</w:t>
+              <w:t>stance, toe</w:t>
             </w:r>
             <w:r>
               <w:rPr>
@@ -490,15 +400,7 @@
                 <w:szCs w:val="16"/>
               </w:rPr>
               <w:noBreakHyphen/>
-              <w:t xml:space="preserve">off, </w:t>
-            </w:r>
-            <w:proofErr w:type="spellStart"/>
-            <w:r>
-              <w:rPr>
-                <w:sz w:val="18"/>
-                <w:szCs w:val="16"/>
-              </w:rPr>
-              <w:t>heel</w:t>
+              <w:t>off, heel</w:t>
             </w:r>
             <w:r>
               <w:rPr>
@@ -506,15 +408,7 @@
                 <w:szCs w:val="16"/>
               </w:rPr>
               <w:noBreakHyphen/>
-              <w:t>whip</w:t>
-            </w:r>
-            <w:proofErr w:type="spellEnd"/>
-            <w:r>
-              <w:rPr>
-                <w:sz w:val="18"/>
-                <w:szCs w:val="16"/>
-              </w:rPr>
-              <w:t>, etc. para ambos pies).</w:t>
+              <w:t>whip, etc. para ambos pies).</w:t>
             </w:r>
           </w:p>
         </w:tc>
@@ -538,7 +432,6 @@
                 <w:szCs w:val="16"/>
               </w:rPr>
             </w:pPr>
-            <w:proofErr w:type="spellStart"/>
             <w:r>
               <w:rPr>
                 <w:sz w:val="18"/>
@@ -546,7 +439,6 @@
               </w:rPr>
               <w:t>rotation_mat</w:t>
             </w:r>
-            <w:proofErr w:type="spellEnd"/>
           </w:p>
         </w:tc>
         <w:tc>
@@ -593,39 +485,7 @@
                 <w:sz w:val="18"/>
                 <w:szCs w:val="16"/>
               </w:rPr>
-              <w:t>Para cada segmento/</w:t>
-            </w:r>
-            <w:proofErr w:type="spellStart"/>
-            <w:r>
-              <w:rPr>
-                <w:sz w:val="18"/>
-                <w:szCs w:val="16"/>
-              </w:rPr>
-              <w:t>joint</w:t>
-            </w:r>
-            <w:proofErr w:type="spellEnd"/>
-            <w:r>
-              <w:rPr>
-                <w:sz w:val="18"/>
-                <w:szCs w:val="16"/>
-              </w:rPr>
-              <w:t xml:space="preserve"> (ej. '</w:t>
-            </w:r>
-            <w:proofErr w:type="spellStart"/>
-            <w:r>
-              <w:rPr>
-                <w:sz w:val="18"/>
-                <w:szCs w:val="16"/>
-              </w:rPr>
-              <w:t>L_foot</w:t>
-            </w:r>
-            <w:proofErr w:type="spellEnd"/>
-            <w:r>
-              <w:rPr>
-                <w:sz w:val="18"/>
-                <w:szCs w:val="16"/>
-              </w:rPr>
-              <w:t>'), contiene una matriz de rotación 3×3×N (orientación en el sistema original).</w:t>
+              <w:t>Para cada segmento/joint (ej. 'L_foot'), contiene una matriz de rotación 3×3×N (orientación en el sistema original).</w:t>
             </w:r>
           </w:p>
         </w:tc>
@@ -646,7 +506,6 @@
                 <w:szCs w:val="16"/>
               </w:rPr>
             </w:pPr>
-            <w:proofErr w:type="spellStart"/>
             <w:r>
               <w:rPr>
                 <w:sz w:val="18"/>
@@ -654,7 +513,6 @@
               </w:rPr>
               <w:t>markers_running</w:t>
             </w:r>
-            <w:proofErr w:type="spellEnd"/>
           </w:p>
         </w:tc>
         <w:tc>
@@ -778,23 +636,7 @@
                 <w:sz w:val="18"/>
                 <w:szCs w:val="16"/>
               </w:rPr>
-              <w:t xml:space="preserve">Para cada articulación/segmento en </w:t>
-            </w:r>
-            <w:proofErr w:type="spellStart"/>
-            <w:r>
-              <w:rPr>
-                <w:sz w:val="18"/>
-                <w:szCs w:val="16"/>
-              </w:rPr>
-              <w:t>listangles_joints</w:t>
-            </w:r>
-            <w:proofErr w:type="spellEnd"/>
-            <w:r>
-              <w:rPr>
-                <w:sz w:val="18"/>
-                <w:szCs w:val="16"/>
-              </w:rPr>
-              <w:t>, contiene una matriz 3×N con los ángulos de Cardan (en radianes) en el sistema original.</w:t>
+              <w:t>Para cada articulación/segmento en listangles_joints, contiene una matriz 3×N con los ángulos de Cardan (en radianes) en el sistema original.</w:t>
             </w:r>
           </w:p>
         </w:tc>
@@ -878,7 +720,6 @@
                 <w:szCs w:val="16"/>
               </w:rPr>
             </w:pPr>
-            <w:proofErr w:type="spellStart"/>
             <w:r>
               <w:rPr>
                 <w:sz w:val="18"/>
@@ -886,7 +727,6 @@
               </w:rPr>
               <w:t>new_ref_rotation_mat</w:t>
             </w:r>
-            <w:proofErr w:type="spellEnd"/>
           </w:p>
         </w:tc>
         <w:tc>
@@ -933,23 +773,7 @@
                 <w:sz w:val="18"/>
                 <w:szCs w:val="16"/>
               </w:rPr>
-              <w:t>Matrices de rotación transformadas al nuevo sistema de referencia (X = dirección de marcha, Y = vertical, Z = lateral derecha). Para cada segmento/</w:t>
-            </w:r>
-            <w:proofErr w:type="spellStart"/>
-            <w:r>
-              <w:rPr>
-                <w:sz w:val="18"/>
-                <w:szCs w:val="16"/>
-              </w:rPr>
-              <w:t>joint</w:t>
-            </w:r>
-            <w:proofErr w:type="spellEnd"/>
-            <w:r>
-              <w:rPr>
-                <w:sz w:val="18"/>
-                <w:szCs w:val="16"/>
-              </w:rPr>
-              <w:t>.</w:t>
+              <w:t>Matrices de rotación transformadas al nuevo sistema de referencia (X = dirección de marcha, Y = vertical, Z = lateral derecha). Para cada segmento/joint.</w:t>
             </w:r>
           </w:p>
         </w:tc>
@@ -970,7 +794,6 @@
                 <w:szCs w:val="16"/>
               </w:rPr>
             </w:pPr>
-            <w:proofErr w:type="spellStart"/>
             <w:r>
               <w:rPr>
                 <w:sz w:val="18"/>
@@ -978,7 +801,6 @@
               </w:rPr>
               <w:t>gyro</w:t>
             </w:r>
-            <w:proofErr w:type="spellEnd"/>
           </w:p>
         </w:tc>
         <w:tc>
@@ -1025,23 +847,7 @@
                 <w:sz w:val="18"/>
                 <w:szCs w:val="16"/>
               </w:rPr>
-              <w:t>Velocidad angular simulada en el marco de la IMU (marco móvil). Para cada segmento/</w:t>
-            </w:r>
-            <w:proofErr w:type="spellStart"/>
-            <w:r>
-              <w:rPr>
-                <w:sz w:val="18"/>
-                <w:szCs w:val="16"/>
-              </w:rPr>
-              <w:t>joint</w:t>
-            </w:r>
-            <w:proofErr w:type="spellEnd"/>
-            <w:r>
-              <w:rPr>
-                <w:sz w:val="18"/>
-                <w:szCs w:val="16"/>
-              </w:rPr>
-              <w:t>. Dimensiones: 3×(N</w:t>
+              <w:t>Velocidad angular simulada en el marco de la IMU (marco móvil). Para cada segmento/joint. Dimensiones: 3×(N</w:t>
             </w:r>
             <w:r>
               <w:rPr>
@@ -1073,7 +879,6 @@
                 <w:szCs w:val="16"/>
               </w:rPr>
             </w:pPr>
-            <w:proofErr w:type="spellStart"/>
             <w:r>
               <w:rPr>
                 <w:sz w:val="18"/>
@@ -1081,7 +886,6 @@
               </w:rPr>
               <w:t>acc</w:t>
             </w:r>
-            <w:proofErr w:type="spellEnd"/>
           </w:p>
         </w:tc>
         <w:tc>
@@ -1128,23 +932,7 @@
                 <w:sz w:val="18"/>
                 <w:szCs w:val="16"/>
               </w:rPr>
-              <w:t xml:space="preserve">Aceleración total (lineal + gravedad) simulada en el marco de la IMU. Solo para segmentos con marcadores (los de </w:t>
-            </w:r>
-            <w:proofErr w:type="spellStart"/>
-            <w:r>
-              <w:rPr>
-                <w:sz w:val="18"/>
-                <w:szCs w:val="16"/>
-              </w:rPr>
-              <w:t>listsegment_joints</w:t>
-            </w:r>
-            <w:proofErr w:type="spellEnd"/>
-            <w:r>
-              <w:rPr>
-                <w:sz w:val="18"/>
-                <w:szCs w:val="16"/>
-              </w:rPr>
-              <w:t>). Dimensiones: 3×(N</w:t>
+              <w:t>Aceleración total (lineal + gravedad) simulada en el marco de la IMU. Solo para segmentos con marcadores (los de listsegment_joints). Dimensiones: 3×(N</w:t>
             </w:r>
             <w:r>
               <w:rPr>
@@ -1173,7 +961,6 @@
                 <w:szCs w:val="16"/>
               </w:rPr>
             </w:pPr>
-            <w:proofErr w:type="spellStart"/>
             <w:r>
               <w:rPr>
                 <w:sz w:val="18"/>
@@ -1181,7 +968,6 @@
               </w:rPr>
               <w:t>angles_interp</w:t>
             </w:r>
-            <w:proofErr w:type="spellEnd"/>
           </w:p>
         </w:tc>
         <w:tc>
@@ -1228,39 +1014,7 @@
                 <w:sz w:val="18"/>
                 <w:szCs w:val="16"/>
               </w:rPr>
-              <w:t>Ángulos de Cardan interpolados a una longitud fija de paso (</w:t>
-            </w:r>
-            <w:proofErr w:type="spellStart"/>
-            <w:r>
-              <w:rPr>
-                <w:sz w:val="18"/>
-                <w:szCs w:val="16"/>
-              </w:rPr>
-              <w:t>len_max_step</w:t>
-            </w:r>
-            <w:proofErr w:type="spellEnd"/>
-            <w:r>
-              <w:rPr>
-                <w:sz w:val="18"/>
-                <w:szCs w:val="16"/>
-              </w:rPr>
-              <w:t xml:space="preserve"> = 180). Solo para articulaciones/segmentos en </w:t>
-            </w:r>
-            <w:proofErr w:type="spellStart"/>
-            <w:r>
-              <w:rPr>
-                <w:sz w:val="18"/>
-                <w:szCs w:val="16"/>
-              </w:rPr>
-              <w:t>listangles_joints</w:t>
-            </w:r>
-            <w:proofErr w:type="spellEnd"/>
-            <w:r>
-              <w:rPr>
-                <w:sz w:val="18"/>
-                <w:szCs w:val="16"/>
-              </w:rPr>
-              <w:t>. Dimensiones: (nPasos</w:t>
+              <w:t>Ángulos de Cardan interpolados a una longitud fija de paso (len_max_step = 180). Solo para articulaciones/segmentos en listangles_joints. Dimensiones: (nPasos</w:t>
             </w:r>
             <w:r>
               <w:rPr>
@@ -1292,7 +1046,6 @@
                 <w:szCs w:val="16"/>
               </w:rPr>
             </w:pPr>
-            <w:proofErr w:type="spellStart"/>
             <w:r>
               <w:rPr>
                 <w:sz w:val="18"/>
@@ -1300,7 +1053,6 @@
               </w:rPr>
               <w:t>gyro_interp</w:t>
             </w:r>
-            <w:proofErr w:type="spellEnd"/>
           </w:p>
         </w:tc>
         <w:tc>
@@ -1347,23 +1099,7 @@
                 <w:sz w:val="18"/>
                 <w:szCs w:val="16"/>
               </w:rPr>
-              <w:t>Velocidad angular interpolada a longitud fija de paso. Para todos los segmentos/</w:t>
-            </w:r>
-            <w:proofErr w:type="spellStart"/>
-            <w:r>
-              <w:rPr>
-                <w:sz w:val="18"/>
-                <w:szCs w:val="16"/>
-              </w:rPr>
-              <w:t>joints</w:t>
-            </w:r>
-            <w:proofErr w:type="spellEnd"/>
-            <w:r>
-              <w:rPr>
-                <w:sz w:val="18"/>
-                <w:szCs w:val="16"/>
-              </w:rPr>
-              <w:t>. Dimensiones: (nPasos</w:t>
+              <w:t>Velocidad angular interpolada a longitud fija de paso. Para todos los segmentos/joints. Dimensiones: (nPasos</w:t>
             </w:r>
             <w:r>
               <w:rPr>
@@ -1392,7 +1128,6 @@
                 <w:szCs w:val="16"/>
               </w:rPr>
             </w:pPr>
-            <w:proofErr w:type="spellStart"/>
             <w:r>
               <w:rPr>
                 <w:sz w:val="18"/>
@@ -1400,7 +1135,6 @@
               </w:rPr>
               <w:t>acc_interp</w:t>
             </w:r>
-            <w:proofErr w:type="spellEnd"/>
           </w:p>
         </w:tc>
         <w:tc>
@@ -1479,7 +1213,6 @@
                 <w:szCs w:val="16"/>
               </w:rPr>
             </w:pPr>
-            <w:proofErr w:type="spellStart"/>
             <w:r>
               <w:rPr>
                 <w:sz w:val="18"/>
@@ -1487,7 +1220,6 @@
               </w:rPr>
               <w:t>angles_interp_nooutliers</w:t>
             </w:r>
-            <w:proofErr w:type="spellEnd"/>
           </w:p>
         </w:tc>
         <w:tc>
@@ -1534,39 +1266,7 @@
                 <w:sz w:val="18"/>
                 <w:szCs w:val="16"/>
               </w:rPr>
-              <w:t xml:space="preserve">Igual que </w:t>
-            </w:r>
-            <w:proofErr w:type="spellStart"/>
-            <w:r>
-              <w:rPr>
-                <w:sz w:val="18"/>
-                <w:szCs w:val="16"/>
-              </w:rPr>
-              <w:t>angles_interp</w:t>
-            </w:r>
-            <w:proofErr w:type="spellEnd"/>
-            <w:r>
-              <w:rPr>
-                <w:sz w:val="18"/>
-                <w:szCs w:val="16"/>
-              </w:rPr>
-              <w:t xml:space="preserve">, pero se eliminan los pasos identificados como </w:t>
-            </w:r>
-            <w:proofErr w:type="spellStart"/>
-            <w:r>
-              <w:rPr>
-                <w:sz w:val="18"/>
-                <w:szCs w:val="16"/>
-              </w:rPr>
-              <w:t>outliers</w:t>
-            </w:r>
-            <w:proofErr w:type="spellEnd"/>
-            <w:r>
-              <w:rPr>
-                <w:sz w:val="18"/>
-                <w:szCs w:val="16"/>
-              </w:rPr>
-              <w:t>.</w:t>
+              <w:t>Igual que angles_interp, pero se eliminan los pasos identificados como outliers.</w:t>
             </w:r>
           </w:p>
         </w:tc>
@@ -1587,7 +1287,6 @@
                 <w:szCs w:val="16"/>
               </w:rPr>
             </w:pPr>
-            <w:proofErr w:type="spellStart"/>
             <w:r>
               <w:rPr>
                 <w:sz w:val="18"/>
@@ -1595,7 +1294,6 @@
               </w:rPr>
               <w:t>gyro_interp_nooutliers</w:t>
             </w:r>
-            <w:proofErr w:type="spellEnd"/>
           </w:p>
         </w:tc>
         <w:tc>
@@ -1642,39 +1340,7 @@
                 <w:sz w:val="18"/>
                 <w:szCs w:val="16"/>
               </w:rPr>
-              <w:t xml:space="preserve">Igual que </w:t>
-            </w:r>
-            <w:proofErr w:type="spellStart"/>
-            <w:r>
-              <w:rPr>
-                <w:sz w:val="18"/>
-                <w:szCs w:val="16"/>
-              </w:rPr>
-              <w:t>gyro_interp</w:t>
-            </w:r>
-            <w:proofErr w:type="spellEnd"/>
-            <w:r>
-              <w:rPr>
-                <w:sz w:val="18"/>
-                <w:szCs w:val="16"/>
-              </w:rPr>
-              <w:t xml:space="preserve">, pero eliminando </w:t>
-            </w:r>
-            <w:proofErr w:type="spellStart"/>
-            <w:r>
-              <w:rPr>
-                <w:sz w:val="18"/>
-                <w:szCs w:val="16"/>
-              </w:rPr>
-              <w:t>outliers</w:t>
-            </w:r>
-            <w:proofErr w:type="spellEnd"/>
-            <w:r>
-              <w:rPr>
-                <w:sz w:val="18"/>
-                <w:szCs w:val="16"/>
-              </w:rPr>
-              <w:t>.</w:t>
+              <w:t>Igual que gyro_interp, pero eliminando outliers.</w:t>
             </w:r>
           </w:p>
         </w:tc>
@@ -1698,7 +1364,6 @@
                 <w:szCs w:val="16"/>
               </w:rPr>
             </w:pPr>
-            <w:proofErr w:type="spellStart"/>
             <w:r>
               <w:rPr>
                 <w:sz w:val="18"/>
@@ -1706,7 +1371,6 @@
               </w:rPr>
               <w:t>acc_interp_nooutliers</w:t>
             </w:r>
-            <w:proofErr w:type="spellEnd"/>
           </w:p>
         </w:tc>
         <w:tc>
@@ -1753,39 +1417,7 @@
                 <w:sz w:val="18"/>
                 <w:szCs w:val="16"/>
               </w:rPr>
-              <w:t xml:space="preserve">Igual que </w:t>
-            </w:r>
-            <w:proofErr w:type="spellStart"/>
-            <w:r>
-              <w:rPr>
-                <w:sz w:val="18"/>
-                <w:szCs w:val="16"/>
-              </w:rPr>
-              <w:t>acc_interp</w:t>
-            </w:r>
-            <w:proofErr w:type="spellEnd"/>
-            <w:r>
-              <w:rPr>
-                <w:sz w:val="18"/>
-                <w:szCs w:val="16"/>
-              </w:rPr>
-              <w:t xml:space="preserve">, pero eliminando </w:t>
-            </w:r>
-            <w:proofErr w:type="spellStart"/>
-            <w:r>
-              <w:rPr>
-                <w:sz w:val="18"/>
-                <w:szCs w:val="16"/>
-              </w:rPr>
-              <w:t>outliers</w:t>
-            </w:r>
-            <w:proofErr w:type="spellEnd"/>
-            <w:r>
-              <w:rPr>
-                <w:sz w:val="18"/>
-                <w:szCs w:val="16"/>
-              </w:rPr>
-              <w:t>.</w:t>
+              <w:t>Igual que acc_interp, pero eliminando outliers.</w:t>
             </w:r>
           </w:p>
         </w:tc>
@@ -1806,7 +1438,6 @@
                 <w:szCs w:val="16"/>
               </w:rPr>
             </w:pPr>
-            <w:proofErr w:type="spellStart"/>
             <w:r>
               <w:rPr>
                 <w:sz w:val="18"/>
@@ -1814,7 +1445,6 @@
               </w:rPr>
               <w:t>outliers</w:t>
             </w:r>
-            <w:proofErr w:type="spellEnd"/>
           </w:p>
         </w:tc>
         <w:tc>
@@ -1861,23 +1491,7 @@
                 <w:sz w:val="18"/>
                 <w:szCs w:val="16"/>
               </w:rPr>
-              <w:t>Índices (números de paso) que fueron marcados como atípicos (</w:t>
-            </w:r>
-            <w:proofErr w:type="spellStart"/>
-            <w:r>
-              <w:rPr>
-                <w:sz w:val="18"/>
-                <w:szCs w:val="16"/>
-              </w:rPr>
-              <w:t>outliers</w:t>
-            </w:r>
-            <w:proofErr w:type="spellEnd"/>
-            <w:r>
-              <w:rPr>
-                <w:sz w:val="18"/>
-                <w:szCs w:val="16"/>
-              </w:rPr>
-              <w:t>) según los ángulos interpolados.</w:t>
+              <w:t>Índices (números de paso) que fueron marcados como atípicos (outliers) según los ángulos interpolados.</w:t>
             </w:r>
           </w:p>
         </w:tc>
@@ -1901,7 +1515,6 @@
                 <w:szCs w:val="16"/>
               </w:rPr>
             </w:pPr>
-            <w:proofErr w:type="spellStart"/>
             <w:r>
               <w:rPr>
                 <w:sz w:val="18"/>
@@ -1910,7 +1523,6 @@
               <w:lastRenderedPageBreak/>
               <w:t>R_phase_flag</w:t>
             </w:r>
-            <w:proofErr w:type="spellEnd"/>
           </w:p>
         </w:tc>
         <w:tc>
@@ -1965,23 +1577,7 @@
                 <w:szCs w:val="16"/>
               </w:rPr>
               <w:noBreakHyphen/>
-              <w:t xml:space="preserve">2) × 180. Cada valor es un entero que indica la fase (1: apoyo, 2: despegue, 3: balanceo, 4: otra </w:t>
-            </w:r>
-            <w:proofErr w:type="spellStart"/>
-            <w:r>
-              <w:rPr>
-                <w:sz w:val="18"/>
-                <w:szCs w:val="16"/>
-              </w:rPr>
-              <w:t>subfase</w:t>
-            </w:r>
-            <w:proofErr w:type="spellEnd"/>
-            <w:r>
-              <w:rPr>
-                <w:sz w:val="18"/>
-                <w:szCs w:val="16"/>
-              </w:rPr>
-              <w:t>).</w:t>
+              <w:t>2) × 180. Cada valor es un entero que indica la fase (1: apoyo, 2: despegue, 3: balanceo, 4: otra subfase).</w:t>
             </w:r>
           </w:p>
         </w:tc>
@@ -2002,7 +1598,6 @@
                 <w:szCs w:val="16"/>
               </w:rPr>
             </w:pPr>
-            <w:proofErr w:type="spellStart"/>
             <w:r>
               <w:rPr>
                 <w:sz w:val="18"/>
@@ -2010,7 +1605,6 @@
               </w:rPr>
               <w:t>L_phase_flag</w:t>
             </w:r>
-            <w:proofErr w:type="spellEnd"/>
           </w:p>
         </w:tc>
         <w:tc>
@@ -2089,7 +1683,6 @@
                 <w:szCs w:val="16"/>
               </w:rPr>
             </w:pPr>
-            <w:proofErr w:type="spellStart"/>
             <w:r>
               <w:rPr>
                 <w:sz w:val="18"/>
@@ -2097,7 +1690,6 @@
               </w:rPr>
               <w:t>R_phase_flag_nooutliers</w:t>
             </w:r>
-            <w:proofErr w:type="spellEnd"/>
           </w:p>
         </w:tc>
         <w:tc>
@@ -2144,39 +1736,7 @@
                 <w:sz w:val="18"/>
                 <w:szCs w:val="16"/>
               </w:rPr>
-              <w:t xml:space="preserve">Igual que </w:t>
-            </w:r>
-            <w:proofErr w:type="spellStart"/>
-            <w:r>
-              <w:rPr>
-                <w:sz w:val="18"/>
-                <w:szCs w:val="16"/>
-              </w:rPr>
-              <w:t>R_phase_flag</w:t>
-            </w:r>
-            <w:proofErr w:type="spellEnd"/>
-            <w:r>
-              <w:rPr>
-                <w:sz w:val="18"/>
-                <w:szCs w:val="16"/>
-              </w:rPr>
-              <w:t xml:space="preserve">, pero sin los pasos </w:t>
-            </w:r>
-            <w:proofErr w:type="spellStart"/>
-            <w:r>
-              <w:rPr>
-                <w:sz w:val="18"/>
-                <w:szCs w:val="16"/>
-              </w:rPr>
-              <w:t>outlier</w:t>
-            </w:r>
-            <w:proofErr w:type="spellEnd"/>
-            <w:r>
-              <w:rPr>
-                <w:sz w:val="18"/>
-                <w:szCs w:val="16"/>
-              </w:rPr>
-              <w:t>.</w:t>
+              <w:t>Igual que R_phase_flag, pero sin los pasos outlier.</w:t>
             </w:r>
           </w:p>
         </w:tc>
@@ -2197,7 +1757,6 @@
                 <w:szCs w:val="16"/>
               </w:rPr>
             </w:pPr>
-            <w:proofErr w:type="spellStart"/>
             <w:r>
               <w:rPr>
                 <w:sz w:val="18"/>
@@ -2205,7 +1764,6 @@
               </w:rPr>
               <w:t>L_phase_flag_nooutliers</w:t>
             </w:r>
-            <w:proofErr w:type="spellEnd"/>
           </w:p>
         </w:tc>
         <w:tc>
@@ -2252,45 +1810,51 @@
                 <w:sz w:val="18"/>
                 <w:szCs w:val="16"/>
               </w:rPr>
-              <w:t xml:space="preserve">Igual que </w:t>
-            </w:r>
-            <w:proofErr w:type="spellStart"/>
-            <w:r>
-              <w:rPr>
-                <w:sz w:val="18"/>
-                <w:szCs w:val="16"/>
-              </w:rPr>
-              <w:t>L_phase_flag</w:t>
-            </w:r>
-            <w:proofErr w:type="spellEnd"/>
-            <w:r>
-              <w:rPr>
-                <w:sz w:val="18"/>
-                <w:szCs w:val="16"/>
-              </w:rPr>
-              <w:t xml:space="preserve">, pero sin los pasos </w:t>
-            </w:r>
-            <w:proofErr w:type="spellStart"/>
-            <w:r>
-              <w:rPr>
-                <w:sz w:val="18"/>
-                <w:szCs w:val="16"/>
-              </w:rPr>
-              <w:t>outlier</w:t>
-            </w:r>
-            <w:proofErr w:type="spellEnd"/>
-            <w:r>
-              <w:rPr>
-                <w:sz w:val="18"/>
-                <w:szCs w:val="16"/>
-              </w:rPr>
-              <w:t>.</w:t>
+              <w:t>Igual que L_phase_flag, pero sin los pasos outlier.</w:t>
             </w:r>
           </w:p>
         </w:tc>
       </w:tr>
     </w:tbl>
-    <w:p/>
+    <w:p>
+      <w:r>
+        <w:drawing>
+          <wp:inline distT="0" distB="0" distL="0" distR="0" wp14:anchorId="0482306F" wp14:editId="1188C341">
+            <wp:extent cx="2505425" cy="2619741"/>
+            <wp:effectExtent l="0" t="0" r="9525" b="9525"/>
+            <wp:docPr id="625985707" name="Imagen 1"/>
+            <wp:cNvGraphicFramePr>
+              <a:graphicFrameLocks xmlns:a="http://schemas.openxmlformats.org/drawingml/2006/main" noChangeAspect="1"/>
+            </wp:cNvGraphicFramePr>
+            <a:graphic xmlns:a="http://schemas.openxmlformats.org/drawingml/2006/main">
+              <a:graphicData uri="http://schemas.openxmlformats.org/drawingml/2006/picture">
+                <pic:pic xmlns:pic="http://schemas.openxmlformats.org/drawingml/2006/picture">
+                  <pic:nvPicPr>
+                    <pic:cNvPr id="625985707" name=""/>
+                    <pic:cNvPicPr/>
+                  </pic:nvPicPr>
+                  <pic:blipFill>
+                    <a:blip r:embed="rId5"/>
+                    <a:stretch>
+                      <a:fillRect/>
+                    </a:stretch>
+                  </pic:blipFill>
+                  <pic:spPr>
+                    <a:xfrm>
+                      <a:off x="0" y="0"/>
+                      <a:ext cx="2505425" cy="2619741"/>
+                    </a:xfrm>
+                    <a:prstGeom prst="rect">
+                      <a:avLst/>
+                    </a:prstGeom>
+                  </pic:spPr>
+                </pic:pic>
+              </a:graphicData>
+            </a:graphic>
+          </wp:inline>
+        </w:drawing>
+      </w:r>
+    </w:p>
     <w:sectPr>
       <w:pgSz w:w="11906" w:h="16838"/>
       <w:pgMar w:top="1440" w:right="1080" w:bottom="1440" w:left="1080" w:header="708" w:footer="708" w:gutter="0"/>
@@ -3121,6 +2685,7 @@
   <w:style w:type="character" w:default="1" w:styleId="Fuentedeprrafopredeter">
     <w:name w:val="Default Paragraph Font"/>
     <w:uiPriority w:val="1"/>
+    <w:semiHidden/>
     <w:unhideWhenUsed/>
   </w:style>
   <w:style w:type="table" w:default="1" w:styleId="Tablanormal">

</xml_diff>